<commit_message>
Add logo to documentation
</commit_message>
<xml_diff>
--- a/docs/BinaryBeasts.docx
+++ b/docs/BinaryBeasts.docx
@@ -3697,7 +3697,6 @@
                                     <w:text/>
                                   </w:sdtPr>
                                   <w:sdtContent>
-                                    <w:proofErr w:type="spellStart"/>
                                     <w:r>
                                       <w:rPr>
                                         <w:rFonts w:ascii="Times New Roman" w:eastAsiaTheme="majorEastAsia" w:hAnsi="Times New Roman" w:cs="Times New Roman"/>
@@ -3705,9 +3704,8 @@
                                         <w:sz w:val="72"/>
                                         <w:szCs w:val="72"/>
                                       </w:rPr>
-                                      <w:t>BinaryBeasts</w:t>
+                                      <w:t xml:space="preserve">   Binary Beasts</w:t>
                                     </w:r>
-                                    <w:proofErr w:type="spellEnd"/>
                                   </w:sdtContent>
                                 </w:sdt>
                               </w:p>
@@ -3746,6 +3744,60 @@
                                     </w:r>
                                   </w:sdtContent>
                                 </w:sdt>
+                                <w:r>
+                                  <w:rPr>
+                                    <w:rFonts w:ascii="Times New Roman" w:hAnsi="Times New Roman" w:cs="Times New Roman"/>
+                                    <w:noProof/>
+                                  </w:rPr>
+                                  <w:drawing>
+                                    <wp:inline distT="0" distB="0" distL="0" distR="0" wp14:anchorId="222DCB3C" wp14:editId="51DA767E">
+                                      <wp:extent cx="3253740" cy="3253740"/>
+                                      <wp:effectExtent l="0" t="0" r="3810" b="3810"/>
+                                      <wp:docPr id="988892550" name="Picture 27"/>
+                                      <wp:cNvGraphicFramePr>
+                                        <a:graphicFrameLocks xmlns:a="http://schemas.openxmlformats.org/drawingml/2006/main" noChangeAspect="1"/>
+                                      </wp:cNvGraphicFramePr>
+                                      <a:graphic xmlns:a="http://schemas.openxmlformats.org/drawingml/2006/main">
+                                        <a:graphicData uri="http://schemas.openxmlformats.org/drawingml/2006/picture">
+                                          <pic:pic xmlns:pic="http://schemas.openxmlformats.org/drawingml/2006/picture">
+                                            <pic:nvPicPr>
+                                              <pic:cNvPr id="0" name="Picture 1"/>
+                                              <pic:cNvPicPr>
+                                                <a:picLocks noChangeAspect="1" noChangeArrowheads="1"/>
+                                              </pic:cNvPicPr>
+                                            </pic:nvPicPr>
+                                            <pic:blipFill>
+                                              <a:blip r:embed="rId8">
+                                                <a:extLst>
+                                                  <a:ext uri="{28A0092B-C50C-407E-A947-70E740481C1C}">
+                                                    <a14:useLocalDpi xmlns:a14="http://schemas.microsoft.com/office/drawing/2010/main" val="0"/>
+                                                  </a:ext>
+                                                </a:extLst>
+                                              </a:blip>
+                                              <a:srcRect/>
+                                              <a:stretch>
+                                                <a:fillRect/>
+                                              </a:stretch>
+                                            </pic:blipFill>
+                                            <pic:spPr bwMode="auto">
+                                              <a:xfrm>
+                                                <a:off x="0" y="0"/>
+                                                <a:ext cx="3253740" cy="3253740"/>
+                                              </a:xfrm>
+                                              <a:prstGeom prst="rect">
+                                                <a:avLst/>
+                                              </a:prstGeom>
+                                              <a:noFill/>
+                                              <a:ln>
+                                                <a:noFill/>
+                                              </a:ln>
+                                            </pic:spPr>
+                                          </pic:pic>
+                                        </a:graphicData>
+                                      </a:graphic>
+                                    </wp:inline>
+                                  </w:drawing>
+                                </w:r>
                               </w:p>
                             </w:txbxContent>
                           </wps:txbx>
@@ -3800,7 +3852,6 @@
                               <w:text/>
                             </w:sdtPr>
                             <w:sdtContent>
-                              <w:proofErr w:type="spellStart"/>
                               <w:r>
                                 <w:rPr>
                                   <w:rFonts w:ascii="Times New Roman" w:eastAsiaTheme="majorEastAsia" w:hAnsi="Times New Roman" w:cs="Times New Roman"/>
@@ -3808,9 +3859,8 @@
                                   <w:sz w:val="72"/>
                                   <w:szCs w:val="72"/>
                                 </w:rPr>
-                                <w:t>BinaryBeasts</w:t>
+                                <w:t xml:space="preserve">   Binary Beasts</w:t>
                               </w:r>
-                              <w:proofErr w:type="spellEnd"/>
                             </w:sdtContent>
                           </w:sdt>
                         </w:p>
@@ -3849,6 +3899,60 @@
                               </w:r>
                             </w:sdtContent>
                           </w:sdt>
+                          <w:r>
+                            <w:rPr>
+                              <w:rFonts w:ascii="Times New Roman" w:hAnsi="Times New Roman" w:cs="Times New Roman"/>
+                              <w:noProof/>
+                            </w:rPr>
+                            <w:drawing>
+                              <wp:inline distT="0" distB="0" distL="0" distR="0" wp14:anchorId="222DCB3C" wp14:editId="51DA767E">
+                                <wp:extent cx="3253740" cy="3253740"/>
+                                <wp:effectExtent l="0" t="0" r="3810" b="3810"/>
+                                <wp:docPr id="988892550" name="Picture 27"/>
+                                <wp:cNvGraphicFramePr>
+                                  <a:graphicFrameLocks xmlns:a="http://schemas.openxmlformats.org/drawingml/2006/main" noChangeAspect="1"/>
+                                </wp:cNvGraphicFramePr>
+                                <a:graphic xmlns:a="http://schemas.openxmlformats.org/drawingml/2006/main">
+                                  <a:graphicData uri="http://schemas.openxmlformats.org/drawingml/2006/picture">
+                                    <pic:pic xmlns:pic="http://schemas.openxmlformats.org/drawingml/2006/picture">
+                                      <pic:nvPicPr>
+                                        <pic:cNvPr id="0" name="Picture 1"/>
+                                        <pic:cNvPicPr>
+                                          <a:picLocks noChangeAspect="1" noChangeArrowheads="1"/>
+                                        </pic:cNvPicPr>
+                                      </pic:nvPicPr>
+                                      <pic:blipFill>
+                                        <a:blip r:embed="rId8">
+                                          <a:extLst>
+                                            <a:ext uri="{28A0092B-C50C-407E-A947-70E740481C1C}">
+                                              <a14:useLocalDpi xmlns:a14="http://schemas.microsoft.com/office/drawing/2010/main" val="0"/>
+                                            </a:ext>
+                                          </a:extLst>
+                                        </a:blip>
+                                        <a:srcRect/>
+                                        <a:stretch>
+                                          <a:fillRect/>
+                                        </a:stretch>
+                                      </pic:blipFill>
+                                      <pic:spPr bwMode="auto">
+                                        <a:xfrm>
+                                          <a:off x="0" y="0"/>
+                                          <a:ext cx="3253740" cy="3253740"/>
+                                        </a:xfrm>
+                                        <a:prstGeom prst="rect">
+                                          <a:avLst/>
+                                        </a:prstGeom>
+                                        <a:noFill/>
+                                        <a:ln>
+                                          <a:noFill/>
+                                        </a:ln>
+                                      </pic:spPr>
+                                    </pic:pic>
+                                  </a:graphicData>
+                                </a:graphic>
+                              </wp:inline>
+                            </w:drawing>
+                          </w:r>
                         </w:p>
                       </w:txbxContent>
                     </v:textbox>
@@ -5198,6 +5302,7 @@
             <w:t xml:space="preserve">The application’s interface was developed using the </w:t>
           </w:r>
           <w:proofErr w:type="spellStart"/>
+          <w:proofErr w:type="gramStart"/>
           <w:r>
             <w:rPr>
               <w:lang w:val="en-US"/>
@@ -5209,7 +5314,14 @@
             <w:rPr>
               <w:lang w:val="en-US"/>
             </w:rPr>
-            <w:t xml:space="preserve">{Raylib} graphics library. </w:t>
+            <w:t>{</w:t>
+          </w:r>
+          <w:proofErr w:type="gramEnd"/>
+          <w:r>
+            <w:rPr>
+              <w:lang w:val="en-US"/>
+            </w:rPr>
+            <w:t xml:space="preserve">Raylib} graphics library. </w:t>
           </w:r>
           <w:proofErr w:type="spellStart"/>
           <w:r>
@@ -5446,7 +5558,23 @@
                     <w:rFonts w:ascii="Times New Roman" w:hAnsi="Times New Roman" w:cs="Times New Roman"/>
                     <w:lang w:val="en-US"/>
                   </w:rPr>
-                  <w:t xml:space="preserve"> and also the menus of the app.</w:t>
+                  <w:t xml:space="preserve"> </w:t>
+                </w:r>
+                <w:proofErr w:type="gramStart"/>
+                <w:r>
+                  <w:rPr>
+                    <w:rFonts w:ascii="Times New Roman" w:hAnsi="Times New Roman" w:cs="Times New Roman"/>
+                    <w:lang w:val="en-US"/>
+                  </w:rPr>
+                  <w:t>and also</w:t>
+                </w:r>
+                <w:proofErr w:type="gramEnd"/>
+                <w:r>
+                  <w:rPr>
+                    <w:rFonts w:ascii="Times New Roman" w:hAnsi="Times New Roman" w:cs="Times New Roman"/>
+                    <w:lang w:val="en-US"/>
+                  </w:rPr>
+                  <w:t xml:space="preserve"> the menus of the app.</w:t>
                 </w:r>
               </w:p>
             </w:tc>
@@ -5494,7 +5622,23 @@
                     <w:rFonts w:ascii="Times New Roman" w:hAnsi="Times New Roman" w:cs="Times New Roman"/>
                     <w:lang w:val="en-US"/>
                   </w:rPr>
-                  <w:t>In the third week we made the presentation and documentation and now the project is ready to be presented.</w:t>
+                  <w:t xml:space="preserve">In the third week we </w:t>
+                </w:r>
+                <w:proofErr w:type="gramStart"/>
+                <w:r>
+                  <w:rPr>
+                    <w:rFonts w:ascii="Times New Roman" w:hAnsi="Times New Roman" w:cs="Times New Roman"/>
+                    <w:lang w:val="en-US"/>
+                  </w:rPr>
+                  <w:t>made</w:t>
+                </w:r>
+                <w:proofErr w:type="gramEnd"/>
+                <w:r>
+                  <w:rPr>
+                    <w:rFonts w:ascii="Times New Roman" w:hAnsi="Times New Roman" w:cs="Times New Roman"/>
+                    <w:lang w:val="en-US"/>
+                  </w:rPr>
+                  <w:t xml:space="preserve"> the presentation and documentation and now the project is ready to be presented.</w:t>
                 </w:r>
               </w:p>
             </w:tc>
@@ -5794,7 +5938,7 @@
                     </pic:cNvPicPr>
                   </pic:nvPicPr>
                   <pic:blipFill>
-                    <a:blip r:embed="rId8">
+                    <a:blip r:embed="rId9">
                       <a:extLst>
                         <a:ext uri="{28A0092B-C50C-407E-A947-70E740481C1C}">
                           <a14:useLocalDpi xmlns:a14="http://schemas.microsoft.com/office/drawing/2010/main" val="0"/>
@@ -8619,7 +8763,6 @@
       </w:pPr>
     </w:p>
     <w:sectPr>
-      <w:headerReference w:type="default" r:id="rId9"/>
       <w:footerReference w:type="default" r:id="rId10"/>
       <w:footerReference w:type="first" r:id="rId11"/>
       <w:pgSz w:w="11906" w:h="16838"/>
@@ -8739,83 +8882,6 @@
     </w:p>
   </w:footnote>
 </w:footnotes>
-</file>
-
-<file path=word/header1.xml><?xml version="1.0" encoding="utf-8"?>
-<w:hdr xmlns:wpc="http://schemas.microsoft.com/office/word/2010/wordprocessingCanvas" xmlns:cx="http://schemas.microsoft.com/office/drawing/2014/chartex" xmlns:cx1="http://schemas.microsoft.com/office/drawing/2015/9/8/chartex" xmlns:cx2="http://schemas.microsoft.com/office/drawing/2015/10/21/chartex" xmlns:cx3="http://schemas.microsoft.com/office/drawing/2016/5/9/chartex" xmlns:cx4="http://schemas.microsoft.com/office/drawing/2016/5/10/chartex" xmlns:cx5="http://schemas.microsoft.com/office/drawing/2016/5/11/chartex" xmlns:cx6="http://schemas.microsoft.com/office/drawing/2016/5/12/chartex" xmlns:cx7="http://schemas.microsoft.com/office/drawing/2016/5/13/chartex" xmlns:cx8="http://schemas.microsoft.com/office/drawing/2016/5/14/chartex" xmlns:mc="http://schemas.openxmlformats.org/markup-compatibility/2006" xmlns:aink="http://schemas.microsoft.com/office/drawing/2016/ink" xmlns:am3d="http://schemas.microsoft.com/office/drawing/2017/model3d" xmlns:o="urn:schemas-microsoft-com:office:office" xmlns:oel="http://schemas.microsoft.com/office/2019/extlst" xmlns:r="http://schemas.openxmlformats.org/officeDocument/2006/relationships" xmlns:m="http://schemas.openxmlformats.org/officeDocument/2006/math" xmlns:v="urn:schemas-microsoft-com:vml" xmlns:wp14="http://schemas.microsoft.com/office/word/2010/wordprocessingDrawing" xmlns:wp="http://schemas.openxmlformats.org/drawingml/2006/wordprocessingDrawing" xmlns:w10="urn:schemas-microsoft-com:office:word" xmlns:w="http://schemas.openxmlformats.org/wordprocessingml/2006/main" xmlns:w14="http://schemas.microsoft.com/office/word/2010/wordml" xmlns:w15="http://schemas.microsoft.com/office/word/2012/wordml" xmlns:w16cex="http://schemas.microsoft.com/office/word/2018/wordml/cex" xmlns:w16cid="http://schemas.microsoft.com/office/word/2016/wordml/cid" xmlns:w16="http://schemas.microsoft.com/office/word/2018/wordml" xmlns:w16du="http://schemas.microsoft.com/office/word/2023/wordml/word16du" xmlns:w16sdtdh="http://schemas.microsoft.com/office/word/2020/wordml/sdtdatahash" xmlns:w16sdtfl="http://schemas.microsoft.com/office/word/2024/wordml/sdtformatlock" xmlns:w16se="http://schemas.microsoft.com/office/word/2015/wordml/symex" xmlns:wpg="http://schemas.microsoft.com/office/word/2010/wordprocessingGroup" xmlns:wpi="http://schemas.microsoft.com/office/word/2010/wordprocessingInk" xmlns:wne="http://schemas.microsoft.com/office/word/2006/wordml" xmlns:wps="http://schemas.microsoft.com/office/word/2010/wordprocessingShape" mc:Ignorable="w14 w15 w16se w16cid w16 w16cex w16sdtdh w16sdtfl w16du wp14">
-  <w:p>
-    <w:pPr>
-      <w:pStyle w:val="Header"/>
-    </w:pPr>
-    <w:r>
-      <w:rPr>
-        <w:noProof/>
-      </w:rPr>
-      <w:drawing>
-        <wp:anchor distT="0" distB="0" distL="114300" distR="114300" simplePos="0" relativeHeight="251658240" behindDoc="1" locked="0" layoutInCell="1" allowOverlap="1" wp14:anchorId="45F11677" wp14:editId="785CBB5E">
-          <wp:simplePos x="0" y="0"/>
-          <wp:positionH relativeFrom="column">
-            <wp:posOffset>5303520</wp:posOffset>
-          </wp:positionH>
-          <wp:positionV relativeFrom="paragraph">
-            <wp:posOffset>-441960</wp:posOffset>
-          </wp:positionV>
-          <wp:extent cx="906780" cy="906780"/>
-          <wp:effectExtent l="0" t="0" r="0" b="0"/>
-          <wp:wrapTight wrapText="bothSides">
-            <wp:wrapPolygon edited="0">
-              <wp:start x="8622" y="4084"/>
-              <wp:lineTo x="5899" y="6353"/>
-              <wp:lineTo x="5445" y="9529"/>
-              <wp:lineTo x="6353" y="12252"/>
-              <wp:lineTo x="4538" y="17244"/>
-              <wp:lineTo x="16336" y="17244"/>
-              <wp:lineTo x="16790" y="9983"/>
-              <wp:lineTo x="15429" y="7261"/>
-              <wp:lineTo x="12706" y="4084"/>
-              <wp:lineTo x="8622" y="4084"/>
-            </wp:wrapPolygon>
-          </wp:wrapTight>
-          <wp:docPr id="1556492771" name="Picture 30" descr="A blue square with text on it&#10;&#10;AI-generated content may be incorrect."/>
-          <wp:cNvGraphicFramePr>
-            <a:graphicFrameLocks xmlns:a="http://schemas.openxmlformats.org/drawingml/2006/main" noChangeAspect="1"/>
-          </wp:cNvGraphicFramePr>
-          <a:graphic xmlns:a="http://schemas.openxmlformats.org/drawingml/2006/main">
-            <a:graphicData uri="http://schemas.openxmlformats.org/drawingml/2006/picture">
-              <pic:pic xmlns:pic="http://schemas.openxmlformats.org/drawingml/2006/picture">
-                <pic:nvPicPr>
-                  <pic:cNvPr id="1556492771" name="Picture 30" descr="A blue square with text on it&#10;&#10;AI-generated content may be incorrect."/>
-                  <pic:cNvPicPr/>
-                </pic:nvPicPr>
-                <pic:blipFill>
-                  <a:blip r:embed="rId1"/>
-                  <a:stretch>
-                    <a:fillRect/>
-                  </a:stretch>
-                </pic:blipFill>
-                <pic:spPr>
-                  <a:xfrm>
-                    <a:off x="0" y="0"/>
-                    <a:ext cx="906780" cy="906780"/>
-                  </a:xfrm>
-                  <a:prstGeom prst="rect">
-                    <a:avLst/>
-                  </a:prstGeom>
-                </pic:spPr>
-              </pic:pic>
-            </a:graphicData>
-          </a:graphic>
-          <wp14:sizeRelH relativeFrom="margin">
-            <wp14:pctWidth>0</wp14:pctWidth>
-          </wp14:sizeRelH>
-          <wp14:sizeRelV relativeFrom="margin">
-            <wp14:pctHeight>0</wp14:pctHeight>
-          </wp14:sizeRelV>
-        </wp:anchor>
-      </w:drawing>
-    </w:r>
-  </w:p>
-</w:hdr>
 </file>
 
 <file path=word/numbering.xml><?xml version="1.0" encoding="utf-8"?>

</xml_diff>